<commit_message>
Did project planning and task 5
planned task 5 , looked at the feedbakc and tried to sue the week 7 slides and other slides to understand what i cna refine in terms of modeeling and also structred my preort
</commit_message>
<xml_diff>
--- a/Data Processing Report Phase 2.docx
+++ b/Data Processing Report Phase 2.docx
@@ -23,69 +23,65 @@
       </w:pPr>
     </w:p>
     <w:p>
-      <w:proofErr w:type="spellStart"/>
       <w:r>
-        <w:t>Phas</w:t>
+        <w:t xml:space="preserve">Phas 2 of the project builds on the phase 1 of the Mainfreight project. The original system that was modelled represtned a logistic workflow containting staff, shipment tracking, warehouse handling, and transport operations. Weakness that was identified were calss allacotion repsontlitbuty, lack of cohesion and UML_to code mapping . Phase 2 works on improving these and showing professional </w:t>
       </w:r>
-      <w:proofErr w:type="spellEnd"/>
+    </w:p>
+    <w:p/>
+    <w:p>
       <w:r>
-        <w:t xml:space="preserve"> 2 of the project builds on the phase 1 of the Mainfreight project. The original system that was modelled </w:t>
+        <w:t xml:space="preserve">2. Phase 1 </w:t>
       </w:r>
-      <w:proofErr w:type="spellStart"/>
       <w:r>
-        <w:t>represtned</w:t>
+        <w:t xml:space="preserve">weakness inn design and phase 2 refinement </w:t>
       </w:r>
-      <w:proofErr w:type="spellEnd"/>
+    </w:p>
+    <w:p>
       <w:r>
-        <w:t xml:space="preserve"> a </w:t>
+        <w:t>3. Task 5: Refined Static and Dynamic UML Modelling</w:t>
       </w:r>
-      <w:proofErr w:type="gramStart"/>
+    </w:p>
+    <w:p>
       <w:r>
-        <w:t xml:space="preserve">logistic workflow </w:t>
+        <w:t>3.1  refined class diagram plan</w:t>
       </w:r>
-      <w:proofErr w:type="spellStart"/>
+    </w:p>
+    <w:p>
       <w:r>
-        <w:t>containting</w:t>
+        <w:t>3.2 planned sequence diagram</w:t>
       </w:r>
-      <w:proofErr w:type="spellEnd"/>
+    </w:p>
+    <w:p>
       <w:r>
-        <w:t xml:space="preserve"> staff, shipment tracking, warehouse handling, and transport operations</w:t>
+        <w:t>3.3 planned activity and state diagrams</w:t>
       </w:r>
-      <w:proofErr w:type="gramEnd"/>
+    </w:p>
+    <w:p>
       <w:r>
-        <w:t xml:space="preserve">. Weakness that was identified were </w:t>
+        <w:t xml:space="preserve">4. task 6: </w:t>
       </w:r>
-      <w:proofErr w:type="spellStart"/>
       <w:r>
-        <w:t>calss</w:t>
+        <w:t>design pattern and application</w:t>
       </w:r>
-      <w:proofErr w:type="spellEnd"/>
+    </w:p>
+    <w:p>
       <w:r>
-        <w:t xml:space="preserve"> </w:t>
+        <w:t>5. task 7: comparative design analysis</w:t>
       </w:r>
-      <w:proofErr w:type="spellStart"/>
+    </w:p>
+    <w:p>
       <w:r>
-        <w:t>allacotion</w:t>
+        <w:t>6. task 8: critical reflection</w:t>
       </w:r>
-      <w:proofErr w:type="spellEnd"/>
+    </w:p>
+    <w:p>
       <w:r>
-        <w:t xml:space="preserve"> </w:t>
+        <w:t>7.Conclusion</w:t>
       </w:r>
-      <w:proofErr w:type="spellStart"/>
+    </w:p>
+    <w:p>
       <w:r>
-        <w:t>repsontlitbuty</w:t>
-      </w:r>
-      <w:proofErr w:type="spellEnd"/>
-      <w:r>
-        <w:t xml:space="preserve">, lack of cohesion and </w:t>
-      </w:r>
-      <w:proofErr w:type="spellStart"/>
-      <w:r>
-        <w:t>UML_to</w:t>
-      </w:r>
-      <w:proofErr w:type="spellEnd"/>
-      <w:r>
-        <w:t xml:space="preserve"> code mapping . Phase 2 works on improving these and showing professional </w:t>
+        <w:t>8. refernces</w:t>
       </w:r>
     </w:p>
     <w:p/>

</xml_diff>

<commit_message>
Task5 mainly done , still doing task 6
Because of the code and design pattern implementation task 6 is a still bing written in the report , I have also included a screenhsot of whe i last worked on this becasue i forgot to commit on that day.
</commit_message>
<xml_diff>
--- a/Data Processing Report Phase 2.docx
+++ b/Data Processing Report Phase 2.docx
@@ -23,8 +23,61 @@
       </w:pPr>
     </w:p>
     <w:p>
-      <w:r>
-        <w:t xml:space="preserve">Phas 2 of the project builds on the phase 1 of the Mainfreight project. The original system that was modelled represtned a logistic workflow containting staff, shipment tracking, warehouse handling, and transport operations. Weakness that was identified were calss allacotion repsontlitbuty, lack of cohesion and UML_to code mapping . Phase 2 works on improving these and showing professional </w:t>
+      <w:proofErr w:type="spellStart"/>
+      <w:r>
+        <w:t>Phas</w:t>
+      </w:r>
+      <w:proofErr w:type="spellEnd"/>
+      <w:r>
+        <w:t xml:space="preserve"> 2 of the project builds on the phase 1 of the Mainfreight project. The original system that was modelled </w:t>
+      </w:r>
+      <w:proofErr w:type="spellStart"/>
+      <w:r>
+        <w:t>represtned</w:t>
+      </w:r>
+      <w:proofErr w:type="spellEnd"/>
+      <w:r>
+        <w:t xml:space="preserve"> a logistic workflow </w:t>
+      </w:r>
+      <w:proofErr w:type="spellStart"/>
+      <w:r>
+        <w:t>containting</w:t>
+      </w:r>
+      <w:proofErr w:type="spellEnd"/>
+      <w:r>
+        <w:t xml:space="preserve"> staff, shipment tracking, warehouse handling, and transport operations. Weakness that was identified were </w:t>
+      </w:r>
+      <w:proofErr w:type="spellStart"/>
+      <w:r>
+        <w:t>calss</w:t>
+      </w:r>
+      <w:proofErr w:type="spellEnd"/>
+      <w:r>
+        <w:t xml:space="preserve"> </w:t>
+      </w:r>
+      <w:proofErr w:type="spellStart"/>
+      <w:r>
+        <w:t>allacotion</w:t>
+      </w:r>
+      <w:proofErr w:type="spellEnd"/>
+      <w:r>
+        <w:t xml:space="preserve"> </w:t>
+      </w:r>
+      <w:proofErr w:type="spellStart"/>
+      <w:r>
+        <w:t>repsontlitbuty</w:t>
+      </w:r>
+      <w:proofErr w:type="spellEnd"/>
+      <w:r>
+        <w:t xml:space="preserve">, lack of cohesion and </w:t>
+      </w:r>
+      <w:proofErr w:type="spellStart"/>
+      <w:r>
+        <w:t>UML_to</w:t>
+      </w:r>
+      <w:proofErr w:type="spellEnd"/>
+      <w:r>
+        <w:t xml:space="preserve"> code mapping . Phase 2 works on improving these and showing professional </w:t>
       </w:r>
     </w:p>
     <w:p/>
@@ -43,46 +96,1604 @@
     </w:p>
     <w:p>
       <w:r>
-        <w:t>3.1  refined class diagram plan</w:t>
+        <w:t xml:space="preserve">The Mainfreight Logistics system modelled in phase 1 is improved through the </w:t>
+      </w:r>
+      <w:proofErr w:type="spellStart"/>
+      <w:r>
+        <w:t>reifnedment</w:t>
+      </w:r>
+      <w:proofErr w:type="spellEnd"/>
+      <w:r>
+        <w:t xml:space="preserve"> of the static </w:t>
+      </w:r>
+      <w:proofErr w:type="spellStart"/>
+      <w:r>
+        <w:t>structurr</w:t>
+      </w:r>
+      <w:proofErr w:type="spellEnd"/>
+      <w:r>
+        <w:t xml:space="preserve"> and dynamic </w:t>
+      </w:r>
+      <w:proofErr w:type="spellStart"/>
+      <w:r>
+        <w:t>behabiour</w:t>
+      </w:r>
+      <w:proofErr w:type="spellEnd"/>
+      <w:r>
+        <w:t xml:space="preserve"> of the design.</w:t>
+      </w:r>
+      <w:r>
+        <w:t xml:space="preserve"> The refinement is aimed to improve the abstraction, cohesion, modularity, maintainability , and responsibility allocation across the system.</w:t>
+      </w:r>
+      <w:r>
+        <w:t xml:space="preserve"> Taking the feedback given in phase 1 of the project , the previous design modelled weakness in class </w:t>
+      </w:r>
+      <w:proofErr w:type="spellStart"/>
+      <w:r>
+        <w:t>responlity</w:t>
+      </w:r>
+      <w:proofErr w:type="spellEnd"/>
+      <w:r>
+        <w:t xml:space="preserve"> allocation, cohesion, and UML-</w:t>
+      </w:r>
+      <w:proofErr w:type="spellStart"/>
+      <w:r>
+        <w:t>to_code</w:t>
+      </w:r>
+      <w:proofErr w:type="spellEnd"/>
+      <w:r>
+        <w:t xml:space="preserve"> mapping.</w:t>
+      </w:r>
+      <w:r>
+        <w:t xml:space="preserve"> </w:t>
+      </w:r>
+      <w:r>
+        <w:t>To refine this system</w:t>
+      </w:r>
+      <w:r>
+        <w:t xml:space="preserve"> the design </w:t>
+      </w:r>
+      <w:proofErr w:type="spellStart"/>
+      <w:r>
+        <w:t>focses</w:t>
+      </w:r>
+      <w:proofErr w:type="spellEnd"/>
+      <w:r>
+        <w:t xml:space="preserve"> on making each class , workflow, and the interactions associated </w:t>
+      </w:r>
+      <w:proofErr w:type="spellStart"/>
+      <w:r>
+        <w:t>wth</w:t>
+      </w:r>
+      <w:proofErr w:type="spellEnd"/>
+      <w:r>
+        <w:t xml:space="preserve"> them easier to translate and justify to the final </w:t>
+      </w:r>
+      <w:proofErr w:type="spellStart"/>
+      <w:r>
+        <w:t>c#</w:t>
+      </w:r>
+      <w:proofErr w:type="spellEnd"/>
+      <w:r>
+        <w:t xml:space="preserve"> </w:t>
+      </w:r>
+      <w:proofErr w:type="spellStart"/>
+      <w:r>
+        <w:t>implemtnations</w:t>
+      </w:r>
+      <w:proofErr w:type="spellEnd"/>
+    </w:p>
+    <w:p/>
+    <w:p>
+      <w:r>
+        <w:t>Figure 5.1(</w:t>
+      </w:r>
+      <w:r>
+        <w:t>Refined Class diagram</w:t>
       </w:r>
     </w:p>
     <w:p>
       <w:r>
-        <w:t>3.2 planned sequence diagram</w:t>
+        <w:t>The refined UML class improves the system by separating the</w:t>
+      </w:r>
+      <w:r>
+        <w:t xml:space="preserve"> classes into different </w:t>
+      </w:r>
+      <w:proofErr w:type="spellStart"/>
+      <w:r>
+        <w:t>catergeoreis</w:t>
+      </w:r>
+      <w:proofErr w:type="spellEnd"/>
+      <w:r>
+        <w:t xml:space="preserve"> such as role </w:t>
+      </w:r>
+      <w:proofErr w:type="spellStart"/>
+      <w:r>
+        <w:t>clasees</w:t>
+      </w:r>
+      <w:proofErr w:type="spellEnd"/>
+      <w:r>
+        <w:t>, domain classes, menu/control classes, repository classes, and service classes</w:t>
+      </w:r>
+      <w:r>
+        <w:t>.</w:t>
+      </w:r>
+      <w:r>
+        <w:t xml:space="preserve"> User, Customer, Staff, Admin, </w:t>
+      </w:r>
+      <w:proofErr w:type="spellStart"/>
+      <w:r>
+        <w:t>TransportStaff</w:t>
+      </w:r>
+      <w:proofErr w:type="spellEnd"/>
+      <w:r>
+        <w:t xml:space="preserve">, </w:t>
+      </w:r>
+      <w:proofErr w:type="spellStart"/>
+      <w:r>
+        <w:t>WarhouseStaff</w:t>
+      </w:r>
+      <w:proofErr w:type="spellEnd"/>
+      <w:r>
+        <w:t xml:space="preserve">, and </w:t>
+      </w:r>
+      <w:proofErr w:type="spellStart"/>
+      <w:r>
+        <w:t>CUstomerServiceStaff</w:t>
+      </w:r>
+      <w:proofErr w:type="spellEnd"/>
+      <w:r>
+        <w:t>.</w:t>
+      </w:r>
+      <w:r>
+        <w:t xml:space="preserve"> Common user details are kept in the </w:t>
+      </w:r>
+      <w:r>
+        <w:t xml:space="preserve">User class which is the base class, while the </w:t>
+      </w:r>
+      <w:proofErr w:type="spellStart"/>
+      <w:r>
+        <w:t>specialoed</w:t>
+      </w:r>
+      <w:proofErr w:type="spellEnd"/>
+      <w:r>
+        <w:t xml:space="preserve"> roles inherit and extend the </w:t>
+      </w:r>
+      <w:proofErr w:type="spellStart"/>
+      <w:r>
+        <w:t>behviour</w:t>
+      </w:r>
+      <w:proofErr w:type="spellEnd"/>
+      <w:r>
+        <w:t xml:space="preserve"> </w:t>
+      </w:r>
+      <w:r>
+        <w:t xml:space="preserve">that the different Mainfreight department </w:t>
+      </w:r>
+      <w:r>
+        <w:t>need</w:t>
+      </w:r>
+      <w:r>
+        <w:t xml:space="preserve">, this </w:t>
+      </w:r>
+      <w:proofErr w:type="spellStart"/>
+      <w:r>
+        <w:t>demondtres</w:t>
+      </w:r>
+      <w:proofErr w:type="spellEnd"/>
+      <w:r>
+        <w:t xml:space="preserve"> </w:t>
+      </w:r>
+      <w:r>
+        <w:t>inheritance</w:t>
+      </w:r>
+      <w:r>
+        <w:t xml:space="preserve">. </w:t>
+      </w:r>
+      <w:proofErr w:type="spellStart"/>
+      <w:r>
+        <w:t>Thhe</w:t>
+      </w:r>
+      <w:proofErr w:type="spellEnd"/>
+      <w:r>
+        <w:t xml:space="preserve"> main </w:t>
+      </w:r>
+      <w:r>
+        <w:t xml:space="preserve">business objects in the </w:t>
+      </w:r>
+      <w:proofErr w:type="spellStart"/>
+      <w:r>
+        <w:t>logticis</w:t>
+      </w:r>
+      <w:proofErr w:type="spellEnd"/>
+      <w:r>
+        <w:t xml:space="preserve"> workflow are represented by the domain classes: </w:t>
+      </w:r>
+      <w:r>
+        <w:t xml:space="preserve">Shipment, </w:t>
+      </w:r>
+      <w:proofErr w:type="spellStart"/>
+      <w:r>
+        <w:t>TrackingUpdate</w:t>
+      </w:r>
+      <w:proofErr w:type="spellEnd"/>
+      <w:r>
+        <w:t xml:space="preserve">, </w:t>
+      </w:r>
+      <w:proofErr w:type="spellStart"/>
+      <w:r>
+        <w:t>CustomerEnquiry</w:t>
+      </w:r>
+      <w:proofErr w:type="spellEnd"/>
+      <w:r>
+        <w:t xml:space="preserve">, Inventory, and </w:t>
+      </w:r>
+      <w:proofErr w:type="spellStart"/>
+      <w:r>
+        <w:t>ReturnedGoods</w:t>
+      </w:r>
+      <w:proofErr w:type="spellEnd"/>
+      <w:r>
+        <w:t xml:space="preserve">. This helps to </w:t>
+      </w:r>
+      <w:proofErr w:type="spellStart"/>
+      <w:r>
+        <w:t>impvoe</w:t>
+      </w:r>
+      <w:proofErr w:type="spellEnd"/>
+      <w:r>
+        <w:t xml:space="preserve"> the </w:t>
+      </w:r>
+      <w:r>
+        <w:t>cohesion</w:t>
+      </w:r>
+      <w:r>
+        <w:t xml:space="preserve"> of the system because each class has a more focused </w:t>
+      </w:r>
+      <w:proofErr w:type="spellStart"/>
+      <w:r>
+        <w:t>repspnblibty</w:t>
+      </w:r>
+      <w:proofErr w:type="spellEnd"/>
+      <w:r>
+        <w:t xml:space="preserve"> instead of the system </w:t>
+      </w:r>
+      <w:r>
+        <w:t>having to rely on a large menu or class to handle unrelated class</w:t>
+      </w:r>
+      <w:r>
+        <w:t>.</w:t>
+      </w:r>
+      <w:r>
+        <w:t xml:space="preserve"> </w:t>
+      </w:r>
+      <w:r>
+        <w:t xml:space="preserve">Improving cohesion will make sure that </w:t>
+      </w:r>
+      <w:r>
+        <w:t xml:space="preserve">the design has good reusability and also easier </w:t>
+      </w:r>
+      <w:proofErr w:type="spellStart"/>
+      <w:r>
+        <w:t>maintencnace</w:t>
+      </w:r>
+      <w:proofErr w:type="spellEnd"/>
+      <w:r>
+        <w:t xml:space="preserve">, it will </w:t>
+      </w:r>
+      <w:proofErr w:type="spellStart"/>
+      <w:r>
+        <w:t>elimnaite</w:t>
+      </w:r>
+      <w:proofErr w:type="spellEnd"/>
+      <w:r>
+        <w:t xml:space="preserve"> the chance of </w:t>
+      </w:r>
+      <w:r>
+        <w:t>one feature breaking another.</w:t>
+      </w:r>
+      <w:r>
+        <w:t xml:space="preserve"> </w:t>
+      </w:r>
+    </w:p>
+    <w:p/>
+    <w:p>
+      <w:r>
+        <w:t xml:space="preserve">The class diagram also </w:t>
+      </w:r>
+      <w:r>
+        <w:t xml:space="preserve">improves the modularity by adding more classes such as </w:t>
+      </w:r>
+      <w:proofErr w:type="spellStart"/>
+      <w:r>
+        <w:t>CustomerMenu</w:t>
+      </w:r>
+      <w:proofErr w:type="spellEnd"/>
+      <w:r>
+        <w:t xml:space="preserve">, </w:t>
+      </w:r>
+      <w:proofErr w:type="spellStart"/>
+      <w:r>
+        <w:t>StaffMenu</w:t>
+      </w:r>
+      <w:proofErr w:type="spellEnd"/>
+      <w:r>
+        <w:t xml:space="preserve">, </w:t>
+      </w:r>
+      <w:proofErr w:type="spellStart"/>
+      <w:r>
+        <w:t>ShipemtnCotorller</w:t>
+      </w:r>
+      <w:proofErr w:type="spellEnd"/>
+      <w:r>
+        <w:t xml:space="preserve">, </w:t>
+      </w:r>
+      <w:proofErr w:type="spellStart"/>
+      <w:r>
+        <w:t>AccessControlService</w:t>
+      </w:r>
+      <w:proofErr w:type="spellEnd"/>
+      <w:r>
+        <w:t xml:space="preserve">, </w:t>
+      </w:r>
+      <w:proofErr w:type="spellStart"/>
+      <w:r>
+        <w:t>ShipemtnRepo</w:t>
+      </w:r>
+      <w:proofErr w:type="spellEnd"/>
+      <w:r>
+        <w:t xml:space="preserve">, and </w:t>
+      </w:r>
+      <w:proofErr w:type="spellStart"/>
+      <w:r>
+        <w:t>IShipmentRepo</w:t>
+      </w:r>
+      <w:proofErr w:type="spellEnd"/>
+      <w:r>
+        <w:t xml:space="preserve">. </w:t>
+      </w:r>
+      <w:r>
+        <w:t xml:space="preserve"> In phase  1 </w:t>
+      </w:r>
+      <w:proofErr w:type="spellStart"/>
+      <w:r>
+        <w:t>Program.cs</w:t>
+      </w:r>
+      <w:proofErr w:type="spellEnd"/>
+      <w:r>
+        <w:t xml:space="preserve"> was the class that took are of menu handling, validation, shipment lookup, file </w:t>
+      </w:r>
+      <w:proofErr w:type="spellStart"/>
+      <w:r>
+        <w:t>staorge</w:t>
+      </w:r>
+      <w:proofErr w:type="spellEnd"/>
+      <w:r>
+        <w:t xml:space="preserve">, and workflow control. </w:t>
+      </w:r>
+      <w:r>
+        <w:t xml:space="preserve">So in the refined model </w:t>
+      </w:r>
+      <w:r>
+        <w:lastRenderedPageBreak/>
+        <w:t xml:space="preserve">menu classes handle the user interaction , the controller is used to coordinate the use case logic, the access control service </w:t>
+      </w:r>
+      <w:proofErr w:type="spellStart"/>
+      <w:r>
+        <w:t>checsk</w:t>
+      </w:r>
+      <w:proofErr w:type="spellEnd"/>
+      <w:r>
+        <w:t xml:space="preserve"> the </w:t>
+      </w:r>
+      <w:proofErr w:type="spellStart"/>
+      <w:r>
+        <w:t>permisiion</w:t>
+      </w:r>
+      <w:proofErr w:type="spellEnd"/>
+      <w:r>
+        <w:t xml:space="preserve">, and the </w:t>
+      </w:r>
+      <w:proofErr w:type="spellStart"/>
+      <w:r>
+        <w:t>repositrity</w:t>
+      </w:r>
+      <w:proofErr w:type="spellEnd"/>
+      <w:r>
+        <w:t xml:space="preserve"> manages the </w:t>
+      </w:r>
+      <w:r>
+        <w:t>shipmen</w:t>
+      </w:r>
+      <w:r>
+        <w:t xml:space="preserve"> </w:t>
+      </w:r>
+      <w:r>
+        <w:t>storage</w:t>
+      </w:r>
+      <w:r>
+        <w:t xml:space="preserve"> and</w:t>
+      </w:r>
+      <w:r>
+        <w:t xml:space="preserve"> </w:t>
+      </w:r>
+      <w:proofErr w:type="spellStart"/>
+      <w:r>
+        <w:t>retirbal</w:t>
+      </w:r>
+      <w:proofErr w:type="spellEnd"/>
+      <w:r>
+        <w:t xml:space="preserve">. </w:t>
+      </w:r>
+      <w:r>
+        <w:t xml:space="preserve">Abstraction is </w:t>
+      </w:r>
+      <w:r>
+        <w:t xml:space="preserve">very crucial </w:t>
+      </w:r>
+      <w:r>
+        <w:t xml:space="preserve">to decrease the chance of tight </w:t>
+      </w:r>
+      <w:proofErr w:type="spellStart"/>
+      <w:r>
+        <w:t>coipling</w:t>
+      </w:r>
+      <w:proofErr w:type="spellEnd"/>
+      <w:r>
+        <w:t xml:space="preserve"> an </w:t>
+      </w:r>
+      <w:proofErr w:type="spellStart"/>
+      <w:r>
+        <w:t>dmake</w:t>
+      </w:r>
+      <w:proofErr w:type="spellEnd"/>
+      <w:r>
+        <w:t xml:space="preserve"> a </w:t>
+      </w:r>
+      <w:proofErr w:type="spellStart"/>
+      <w:r>
+        <w:t>cohernr</w:t>
+      </w:r>
+      <w:proofErr w:type="spellEnd"/>
+      <w:r>
+        <w:t xml:space="preserve"> system, interfaces such as the </w:t>
+      </w:r>
+      <w:proofErr w:type="spellStart"/>
+      <w:r>
+        <w:t>IShipemtnRepo</w:t>
+      </w:r>
+      <w:proofErr w:type="spellEnd"/>
+      <w:r>
+        <w:t xml:space="preserve">, </w:t>
+      </w:r>
+      <w:proofErr w:type="spellStart"/>
+      <w:r>
+        <w:t>IAuthroizable</w:t>
+      </w:r>
+      <w:proofErr w:type="spellEnd"/>
+      <w:r>
+        <w:t xml:space="preserve">, and </w:t>
+      </w:r>
+      <w:proofErr w:type="spellStart"/>
+      <w:r>
+        <w:t>ITracking</w:t>
+      </w:r>
+      <w:proofErr w:type="spellEnd"/>
+      <w:r>
+        <w:t xml:space="preserve"> </w:t>
+      </w:r>
+      <w:r>
+        <w:t>are higher level classes(</w:t>
+      </w:r>
+      <w:proofErr w:type="spellStart"/>
+      <w:r>
+        <w:t>interfsces</w:t>
+      </w:r>
+      <w:proofErr w:type="spellEnd"/>
+      <w:r>
+        <w:t xml:space="preserve">) that </w:t>
+      </w:r>
+      <w:proofErr w:type="spellStart"/>
+      <w:r>
+        <w:t>elimcnate</w:t>
+      </w:r>
+      <w:proofErr w:type="spellEnd"/>
+      <w:r>
+        <w:t xml:space="preserve"> too much internal work and make it easier for any other future programmers to </w:t>
+      </w:r>
+      <w:proofErr w:type="spellStart"/>
+      <w:r>
+        <w:t>se</w:t>
+      </w:r>
+      <w:proofErr w:type="spellEnd"/>
+      <w:r>
+        <w:t xml:space="preserve"> and fix b</w:t>
+      </w:r>
+      <w:r>
+        <w:t>ug</w:t>
+      </w:r>
+    </w:p>
+    <w:p/>
+    <w:p>
+      <w:r>
+        <w:t>Figure 5.2 Customer Tracks shipmen Sequence Diagram</w:t>
+      </w:r>
+    </w:p>
+    <w:p/>
+    <w:p>
+      <w:proofErr w:type="spellStart"/>
+      <w:r>
+        <w:t>Seqeucne</w:t>
+      </w:r>
+      <w:proofErr w:type="spellEnd"/>
+      <w:r>
+        <w:t xml:space="preserve"> diagram model the interactions between objects in a single use case and they help demonstrate the order in which the system parts interact to complete a function(</w:t>
+      </w:r>
+      <w:r>
+        <w:t xml:space="preserve">week 7 </w:t>
+      </w:r>
+      <w:proofErr w:type="spellStart"/>
+      <w:r>
+        <w:t>sldies</w:t>
+      </w:r>
+      <w:proofErr w:type="spellEnd"/>
+      <w:r>
+        <w:t>)</w:t>
       </w:r>
     </w:p>
     <w:p>
       <w:r>
-        <w:t>3.3 planned activity and state diagrams</w:t>
+        <w:t xml:space="preserve">The Sequence diagram Customer tracks shipment models the </w:t>
+      </w:r>
+      <w:proofErr w:type="spellStart"/>
+      <w:r>
+        <w:t>respsoblity</w:t>
+      </w:r>
+      <w:proofErr w:type="spellEnd"/>
+      <w:r>
+        <w:t xml:space="preserve"> flow of </w:t>
+      </w:r>
+      <w:r>
+        <w:t>customer to shipment.</w:t>
+      </w:r>
+      <w:r>
+        <w:t xml:space="preserve"> The customer </w:t>
+      </w:r>
+      <w:r>
+        <w:t xml:space="preserve">tracks shipment use case was chosen for sequence modelling because of its </w:t>
+      </w:r>
+      <w:proofErr w:type="spellStart"/>
+      <w:r>
+        <w:t>imprtnac</w:t>
+      </w:r>
+      <w:proofErr w:type="spellEnd"/>
+      <w:r>
+        <w:t xml:space="preserve"> in the customer </w:t>
+      </w:r>
+      <w:proofErr w:type="spellStart"/>
+      <w:r>
+        <w:t>facinf</w:t>
+      </w:r>
+      <w:proofErr w:type="spellEnd"/>
+      <w:r>
+        <w:t xml:space="preserve"> workflow. </w:t>
+      </w:r>
+      <w:proofErr w:type="spellStart"/>
+      <w:r>
+        <w:t>Nalaysing</w:t>
+      </w:r>
+      <w:proofErr w:type="spellEnd"/>
+      <w:r>
+        <w:t xml:space="preserve"> it from a </w:t>
+      </w:r>
+      <w:proofErr w:type="spellStart"/>
+      <w:r>
+        <w:t>stakeolder</w:t>
+      </w:r>
+      <w:proofErr w:type="spellEnd"/>
+      <w:r>
+        <w:t xml:space="preserve"> point of view the customers </w:t>
+      </w:r>
+      <w:proofErr w:type="spellStart"/>
+      <w:r>
+        <w:t>deepdn</w:t>
+      </w:r>
+      <w:proofErr w:type="spellEnd"/>
+      <w:r>
+        <w:t xml:space="preserve"> on the </w:t>
+      </w:r>
+      <w:proofErr w:type="spellStart"/>
+      <w:r>
+        <w:t>fucn</w:t>
+      </w:r>
+      <w:proofErr w:type="spellEnd"/>
+      <w:r>
+        <w:t xml:space="preserve"> </w:t>
+      </w:r>
+      <w:proofErr w:type="spellStart"/>
+      <w:r>
+        <w:t>tion</w:t>
+      </w:r>
+      <w:proofErr w:type="spellEnd"/>
+      <w:r>
+        <w:t xml:space="preserve"> to check the location , status and also track their </w:t>
+      </w:r>
+      <w:proofErr w:type="spellStart"/>
+      <w:r>
+        <w:t>shipemt</w:t>
+      </w:r>
+      <w:proofErr w:type="spellEnd"/>
+      <w:r>
+        <w:t xml:space="preserve">. It is essential they </w:t>
+      </w:r>
+      <w:proofErr w:type="spellStart"/>
+      <w:r>
+        <w:t>ave</w:t>
+      </w:r>
+      <w:proofErr w:type="spellEnd"/>
+      <w:r>
+        <w:t xml:space="preserve"> access to this function without needing to </w:t>
+      </w:r>
+      <w:proofErr w:type="spellStart"/>
+      <w:r>
+        <w:t>intweract</w:t>
+      </w:r>
+      <w:proofErr w:type="spellEnd"/>
+      <w:r>
+        <w:t xml:space="preserve"> manually with the staff</w:t>
+      </w:r>
+      <w:r>
+        <w:t xml:space="preserve">.  One f the main problems identified through </w:t>
+      </w:r>
+      <w:proofErr w:type="spellStart"/>
+      <w:r>
+        <w:t>requeiremtn</w:t>
+      </w:r>
+      <w:proofErr w:type="spellEnd"/>
+      <w:r>
+        <w:t xml:space="preserve"> elicitation in phase 1 was the </w:t>
+      </w:r>
+      <w:proofErr w:type="spellStart"/>
+      <w:r>
+        <w:t>inconsistnetn</w:t>
+      </w:r>
+      <w:proofErr w:type="spellEnd"/>
+      <w:r>
+        <w:t xml:space="preserve"> </w:t>
+      </w:r>
+      <w:proofErr w:type="spellStart"/>
+      <w:r>
+        <w:t>commentation</w:t>
+      </w:r>
+      <w:proofErr w:type="spellEnd"/>
+      <w:r>
+        <w:t xml:space="preserve"> between </w:t>
+      </w:r>
+      <w:proofErr w:type="spellStart"/>
+      <w:r>
+        <w:t>deaprtmetns</w:t>
+      </w:r>
+      <w:proofErr w:type="spellEnd"/>
+      <w:r>
+        <w:t xml:space="preserve"> and </w:t>
+      </w:r>
+      <w:proofErr w:type="spellStart"/>
+      <w:r>
+        <w:t>csutomers</w:t>
+      </w:r>
+      <w:proofErr w:type="spellEnd"/>
+      <w:r>
+        <w:t xml:space="preserve">. If this use case is not modelled, designed and </w:t>
+      </w:r>
+      <w:proofErr w:type="spellStart"/>
+      <w:r>
+        <w:t>impletneted</w:t>
+      </w:r>
+      <w:proofErr w:type="spellEnd"/>
+      <w:r>
+        <w:t xml:space="preserve"> </w:t>
+      </w:r>
+      <w:proofErr w:type="spellStart"/>
+      <w:r>
+        <w:t>acruatley</w:t>
+      </w:r>
+      <w:proofErr w:type="spellEnd"/>
+      <w:r>
+        <w:t xml:space="preserve"> this will only further </w:t>
+      </w:r>
+      <w:r>
+        <w:t>exacerbate the issue</w:t>
+      </w:r>
+      <w:r>
+        <w:t xml:space="preserve">, leading to the customer </w:t>
+      </w:r>
+      <w:proofErr w:type="spellStart"/>
+      <w:r>
+        <w:t>recivinef</w:t>
+      </w:r>
+      <w:proofErr w:type="spellEnd"/>
+      <w:r>
+        <w:t xml:space="preserve"> inaccurate information, delayed information and </w:t>
+      </w:r>
+      <w:proofErr w:type="spellStart"/>
+      <w:r>
+        <w:t>aunathroised</w:t>
+      </w:r>
+      <w:proofErr w:type="spellEnd"/>
+      <w:r>
+        <w:t xml:space="preserve"> access to details also comprising the privacy an </w:t>
+      </w:r>
+      <w:proofErr w:type="spellStart"/>
+      <w:r>
+        <w:t>dof</w:t>
+      </w:r>
+      <w:proofErr w:type="spellEnd"/>
+      <w:r>
+        <w:t xml:space="preserve"> the company.</w:t>
+      </w:r>
+      <w:r>
+        <w:t xml:space="preserve"> </w:t>
+      </w:r>
+      <w:proofErr w:type="spellStart"/>
+      <w:r>
+        <w:t>Modeeling</w:t>
+      </w:r>
+      <w:proofErr w:type="spellEnd"/>
+      <w:r>
+        <w:t xml:space="preserve"> this diagram helps us to implement </w:t>
+      </w:r>
+      <w:r>
+        <w:t xml:space="preserve">encapsulation </w:t>
+      </w:r>
+      <w:proofErr w:type="spellStart"/>
+      <w:r>
+        <w:t>throught</w:t>
+      </w:r>
+      <w:proofErr w:type="spellEnd"/>
+      <w:r>
+        <w:t xml:space="preserve"> our shipment details and shipment object. It helps us to </w:t>
+      </w:r>
+      <w:proofErr w:type="spellStart"/>
+      <w:r>
+        <w:t>implentnt</w:t>
+      </w:r>
+      <w:proofErr w:type="spellEnd"/>
+      <w:r>
+        <w:t xml:space="preserve"> it without </w:t>
+      </w:r>
+      <w:proofErr w:type="spellStart"/>
+      <w:r>
+        <w:t>chanfing</w:t>
+      </w:r>
+      <w:proofErr w:type="spellEnd"/>
+      <w:r>
+        <w:t xml:space="preserve"> the internal </w:t>
+      </w:r>
+      <w:proofErr w:type="spellStart"/>
+      <w:r>
+        <w:t>shioment</w:t>
+      </w:r>
+      <w:proofErr w:type="spellEnd"/>
+      <w:r>
+        <w:t xml:space="preserve"> data. It also helps us implement </w:t>
+      </w:r>
+      <w:r>
+        <w:t>abstraction</w:t>
+      </w:r>
+      <w:r>
+        <w:t>(week something)</w:t>
+      </w:r>
+      <w:r>
+        <w:t xml:space="preserve"> by the removing of the raw data handling </w:t>
+      </w:r>
+      <w:r>
+        <w:t xml:space="preserve">or the storage details by access the </w:t>
+      </w:r>
+      <w:proofErr w:type="spellStart"/>
+      <w:r>
+        <w:t>infor</w:t>
+      </w:r>
+      <w:proofErr w:type="spellEnd"/>
+      <w:r>
+        <w:t xml:space="preserve"> through </w:t>
+      </w:r>
+      <w:proofErr w:type="spellStart"/>
+      <w:r>
+        <w:t>IS</w:t>
+      </w:r>
+      <w:r>
+        <w:t>h</w:t>
+      </w:r>
+      <w:r>
+        <w:t>ipemtnRepo</w:t>
+      </w:r>
+      <w:proofErr w:type="spellEnd"/>
+      <w:r>
+        <w:t xml:space="preserve"> Interface.</w:t>
+      </w:r>
+      <w:r>
+        <w:t xml:space="preserve"> </w:t>
+      </w:r>
+      <w:r>
+        <w:t>The diagram</w:t>
+      </w:r>
+      <w:r>
+        <w:t xml:space="preserve"> begins with the Customer, who moves </w:t>
+      </w:r>
+      <w:proofErr w:type="spellStart"/>
+      <w:r>
+        <w:t>throught</w:t>
+      </w:r>
+      <w:proofErr w:type="spellEnd"/>
+      <w:r>
+        <w:t xml:space="preserve"> the </w:t>
+      </w:r>
+      <w:proofErr w:type="spellStart"/>
+      <w:r>
+        <w:t>CustomerMenu</w:t>
+      </w:r>
+      <w:proofErr w:type="spellEnd"/>
+      <w:r>
+        <w:t xml:space="preserve"> , then goes to </w:t>
+      </w:r>
+      <w:proofErr w:type="spellStart"/>
+      <w:r>
+        <w:t>ShipemntContorller</w:t>
+      </w:r>
+      <w:proofErr w:type="spellEnd"/>
+      <w:r>
+        <w:t xml:space="preserve">, </w:t>
+      </w:r>
+      <w:proofErr w:type="spellStart"/>
+      <w:r>
+        <w:t>AccessContorlSrvice</w:t>
+      </w:r>
+      <w:proofErr w:type="spellEnd"/>
+      <w:r>
+        <w:t xml:space="preserve">, </w:t>
+      </w:r>
+      <w:proofErr w:type="spellStart"/>
+      <w:r>
+        <w:t>ShipemtnRepo</w:t>
+      </w:r>
+      <w:proofErr w:type="spellEnd"/>
+      <w:r>
+        <w:t xml:space="preserve"> and finally </w:t>
+      </w:r>
+      <w:proofErr w:type="spellStart"/>
+      <w:r>
+        <w:t>SHipemnt</w:t>
+      </w:r>
+      <w:proofErr w:type="spellEnd"/>
+      <w:r>
+        <w:t xml:space="preserve">, </w:t>
+      </w:r>
+      <w:r>
+        <w:t xml:space="preserve">The order of the </w:t>
+      </w:r>
+      <w:proofErr w:type="spellStart"/>
+      <w:r>
+        <w:t>repsoblities</w:t>
+      </w:r>
+      <w:proofErr w:type="spellEnd"/>
+      <w:r>
+        <w:t xml:space="preserve"> show that the menu should not directly search shipment data or decide access </w:t>
+      </w:r>
+      <w:proofErr w:type="spellStart"/>
+      <w:r>
+        <w:t>perjsmsiion</w:t>
+      </w:r>
+      <w:proofErr w:type="spellEnd"/>
+      <w:r>
+        <w:t xml:space="preserve">. The menu instead first </w:t>
+      </w:r>
+      <w:r>
+        <w:t xml:space="preserve">collects </w:t>
+      </w:r>
+      <w:proofErr w:type="spellStart"/>
+      <w:r>
+        <w:t>thr</w:t>
+      </w:r>
+      <w:proofErr w:type="spellEnd"/>
+      <w:r>
+        <w:t xml:space="preserve"> request made , then the controller c</w:t>
+      </w:r>
+      <w:r>
+        <w:t xml:space="preserve">lass calls the access control service which checks is the customer has the permission to view </w:t>
+      </w:r>
+      <w:r>
+        <w:t xml:space="preserve">the shipment details or not. Then the shipment </w:t>
+      </w:r>
+      <w:proofErr w:type="spellStart"/>
+      <w:r>
+        <w:t>repostiry</w:t>
+      </w:r>
+      <w:proofErr w:type="spellEnd"/>
+      <w:r>
+        <w:t xml:space="preserve"> </w:t>
+      </w:r>
+      <w:r>
+        <w:t xml:space="preserve">the </w:t>
+      </w:r>
+      <w:proofErr w:type="spellStart"/>
+      <w:r>
+        <w:t>retrives</w:t>
+      </w:r>
+      <w:proofErr w:type="spellEnd"/>
+      <w:r>
+        <w:t xml:space="preserve"> the requested shipment record </w:t>
+      </w:r>
+      <w:r>
+        <w:t>and the shipment object returns its own information.</w:t>
       </w:r>
     </w:p>
     <w:p>
       <w:r>
-        <w:t xml:space="preserve">4. task 6: </w:t>
-      </w:r>
-      <w:r>
-        <w:t>design pattern and application</w:t>
+        <w:t xml:space="preserve">The second sequence </w:t>
+      </w:r>
+      <w:r>
+        <w:t xml:space="preserve">diagram models the use case Staff Updates Shipment Status. This was chosen because the shipment status updates </w:t>
+      </w:r>
+      <w:r>
+        <w:t xml:space="preserve">affects the customer tracking information , the staff visibility and </w:t>
+      </w:r>
+      <w:proofErr w:type="spellStart"/>
+      <w:r>
+        <w:t>devleiry</w:t>
+      </w:r>
+      <w:proofErr w:type="spellEnd"/>
+      <w:r>
+        <w:t xml:space="preserve"> status, </w:t>
+      </w:r>
+      <w:proofErr w:type="spellStart"/>
+      <w:r>
+        <w:t>aswell</w:t>
+      </w:r>
+      <w:proofErr w:type="spellEnd"/>
+      <w:r>
+        <w:t xml:space="preserve"> as shipment history. By not </w:t>
+      </w:r>
+      <w:proofErr w:type="spellStart"/>
+      <w:r>
+        <w:t>deisnging</w:t>
+      </w:r>
+      <w:proofErr w:type="spellEnd"/>
+      <w:r>
+        <w:t xml:space="preserve"> and </w:t>
+      </w:r>
+      <w:proofErr w:type="spellStart"/>
+      <w:r>
+        <w:t>impentning</w:t>
+      </w:r>
+      <w:proofErr w:type="spellEnd"/>
+      <w:r>
+        <w:t xml:space="preserve"> this use case </w:t>
+      </w:r>
+      <w:proofErr w:type="spellStart"/>
+      <w:r>
+        <w:t>prorely</w:t>
+      </w:r>
+      <w:proofErr w:type="spellEnd"/>
+      <w:r>
+        <w:t xml:space="preserve"> it is </w:t>
+      </w:r>
+      <w:proofErr w:type="spellStart"/>
+      <w:r>
+        <w:t>vry</w:t>
+      </w:r>
+      <w:proofErr w:type="spellEnd"/>
+      <w:r>
+        <w:t xml:space="preserve"> easy for </w:t>
+      </w:r>
+      <w:proofErr w:type="spellStart"/>
+      <w:r>
+        <w:t>integrtity</w:t>
+      </w:r>
+      <w:proofErr w:type="spellEnd"/>
+      <w:r>
+        <w:t xml:space="preserve"> of customer information to be </w:t>
+      </w:r>
+      <w:r>
+        <w:lastRenderedPageBreak/>
+        <w:t xml:space="preserve">lost, </w:t>
+      </w:r>
+      <w:proofErr w:type="spellStart"/>
+      <w:r>
+        <w:t>unathrusied</w:t>
+      </w:r>
+      <w:proofErr w:type="spellEnd"/>
+      <w:r>
+        <w:t xml:space="preserve"> staff member being able to access the information, problems with </w:t>
+      </w:r>
+      <w:proofErr w:type="spellStart"/>
+      <w:r>
+        <w:t>cleints</w:t>
+      </w:r>
+      <w:proofErr w:type="spellEnd"/>
+      <w:r>
+        <w:t xml:space="preserve"> such as the </w:t>
+      </w:r>
+      <w:proofErr w:type="spellStart"/>
+      <w:r>
+        <w:t>teacking</w:t>
+      </w:r>
+      <w:proofErr w:type="spellEnd"/>
+      <w:r>
+        <w:t xml:space="preserve"> and postal services that are used. The use case has good scope to be </w:t>
+      </w:r>
+      <w:proofErr w:type="spellStart"/>
+      <w:r>
+        <w:t>abel</w:t>
+      </w:r>
+      <w:proofErr w:type="spellEnd"/>
+      <w:r>
+        <w:t xml:space="preserve"> to demonstrate </w:t>
+      </w:r>
+      <w:proofErr w:type="spellStart"/>
+      <w:r>
+        <w:t>strng</w:t>
+      </w:r>
+      <w:proofErr w:type="spellEnd"/>
+      <w:r>
+        <w:t xml:space="preserve"> </w:t>
+      </w:r>
+      <w:proofErr w:type="spellStart"/>
+      <w:r>
+        <w:t>resopbolity</w:t>
+      </w:r>
+      <w:proofErr w:type="spellEnd"/>
+      <w:r>
+        <w:t xml:space="preserve"> allocation, access control </w:t>
+      </w:r>
+      <w:proofErr w:type="spellStart"/>
+      <w:r>
+        <w:t>encaspuation</w:t>
+      </w:r>
+      <w:proofErr w:type="spellEnd"/>
+      <w:r>
+        <w:t xml:space="preserve"> and modularity. The diagram shows that </w:t>
+      </w:r>
+      <w:r>
+        <w:t xml:space="preserve">Staff access the Staff menu , then once again use </w:t>
+      </w:r>
+      <w:proofErr w:type="spellStart"/>
+      <w:r>
+        <w:t>shipement</w:t>
+      </w:r>
+      <w:proofErr w:type="spellEnd"/>
+      <w:r>
+        <w:t xml:space="preserve"> controller to be able to ask </w:t>
+      </w:r>
+      <w:proofErr w:type="spellStart"/>
+      <w:r>
+        <w:t>accesscontorlservice</w:t>
+      </w:r>
+      <w:proofErr w:type="spellEnd"/>
+      <w:r>
+        <w:t xml:space="preserve"> to </w:t>
+      </w:r>
+      <w:proofErr w:type="spellStart"/>
+      <w:r>
+        <w:t>authrosie</w:t>
+      </w:r>
+      <w:proofErr w:type="spellEnd"/>
+      <w:r>
+        <w:t xml:space="preserve"> the access, the use the shipment repo to check the details </w:t>
+      </w:r>
+      <w:proofErr w:type="spellStart"/>
+      <w:r>
+        <w:t>fo</w:t>
+      </w:r>
+      <w:proofErr w:type="spellEnd"/>
+      <w:r>
+        <w:t xml:space="preserve"> the shipment and then </w:t>
+      </w:r>
+      <w:r>
+        <w:t xml:space="preserve">view, and </w:t>
+      </w:r>
+      <w:proofErr w:type="spellStart"/>
+      <w:r>
+        <w:t>udate</w:t>
+      </w:r>
+      <w:proofErr w:type="spellEnd"/>
+      <w:r>
+        <w:t xml:space="preserve"> the tracking update. </w:t>
+      </w:r>
+      <w:r>
+        <w:t xml:space="preserve">The </w:t>
+      </w:r>
+      <w:proofErr w:type="spellStart"/>
+      <w:r>
+        <w:t>dequence</w:t>
+      </w:r>
+      <w:proofErr w:type="spellEnd"/>
+      <w:r>
+        <w:t xml:space="preserve"> diagram </w:t>
+      </w:r>
+      <w:proofErr w:type="spellStart"/>
+      <w:r>
+        <w:t>suppprts</w:t>
+      </w:r>
+      <w:proofErr w:type="spellEnd"/>
+      <w:r>
+        <w:t xml:space="preserve"> the </w:t>
+      </w:r>
+      <w:proofErr w:type="spellStart"/>
+      <w:r>
+        <w:t>implemtnation</w:t>
+      </w:r>
+      <w:proofErr w:type="spellEnd"/>
+      <w:r>
+        <w:t xml:space="preserve"> of the </w:t>
+      </w:r>
+      <w:proofErr w:type="spellStart"/>
+      <w:r>
+        <w:t>encaspault</w:t>
+      </w:r>
+      <w:r>
+        <w:t>ion</w:t>
+      </w:r>
+      <w:proofErr w:type="spellEnd"/>
+      <w:r>
+        <w:t xml:space="preserve"> an example </w:t>
+      </w:r>
+      <w:r>
+        <w:t xml:space="preserve">of </w:t>
+      </w:r>
+      <w:r>
+        <w:t xml:space="preserve">this is the </w:t>
+      </w:r>
+      <w:proofErr w:type="spellStart"/>
+      <w:r>
+        <w:t>Shipemnt</w:t>
+      </w:r>
+      <w:proofErr w:type="spellEnd"/>
+      <w:r>
+        <w:t xml:space="preserve"> class </w:t>
+      </w:r>
+      <w:r>
+        <w:t xml:space="preserve">controls </w:t>
+      </w:r>
+      <w:r>
+        <w:t xml:space="preserve">the changes to the shipment status </w:t>
+      </w:r>
+      <w:proofErr w:type="spellStart"/>
+      <w:r>
+        <w:t>ad</w:t>
+      </w:r>
+      <w:proofErr w:type="spellEnd"/>
+      <w:r>
+        <w:t xml:space="preserve"> delivery status instead of allowing the other classes to be able tor edit those values . This increases the </w:t>
+      </w:r>
+      <w:proofErr w:type="spellStart"/>
+      <w:r>
+        <w:t>tracbelity</w:t>
+      </w:r>
+      <w:proofErr w:type="spellEnd"/>
+      <w:r>
+        <w:t xml:space="preserve"> in turn increasing </w:t>
+      </w:r>
+      <w:r>
+        <w:t xml:space="preserve">maintainability. </w:t>
+      </w:r>
+      <w:proofErr w:type="spellStart"/>
+      <w:r>
+        <w:t>AccessControlService</w:t>
+      </w:r>
+      <w:proofErr w:type="spellEnd"/>
+      <w:r>
+        <w:t xml:space="preserve"> handles the </w:t>
+      </w:r>
+      <w:proofErr w:type="spellStart"/>
+      <w:r>
+        <w:t>persmisiion</w:t>
+      </w:r>
+      <w:proofErr w:type="spellEnd"/>
+      <w:r>
+        <w:t xml:space="preserve"> rules and </w:t>
+      </w:r>
+      <w:proofErr w:type="spellStart"/>
+      <w:r>
+        <w:t>shipmentRepo</w:t>
+      </w:r>
+      <w:proofErr w:type="spellEnd"/>
+      <w:r>
+        <w:t xml:space="preserve"> handles the data </w:t>
+      </w:r>
+      <w:proofErr w:type="spellStart"/>
+      <w:r>
+        <w:t>retiveal</w:t>
+      </w:r>
+      <w:proofErr w:type="spellEnd"/>
+      <w:r>
+        <w:t xml:space="preserve"> so the business action instead </w:t>
+      </w:r>
+      <w:proofErr w:type="spellStart"/>
+      <w:r>
+        <w:t>becomea</w:t>
+      </w:r>
+      <w:proofErr w:type="spellEnd"/>
+      <w:r>
+        <w:t xml:space="preserve">  </w:t>
+      </w:r>
+      <w:proofErr w:type="spellStart"/>
+      <w:r>
+        <w:t>conorlled</w:t>
+      </w:r>
+      <w:proofErr w:type="spellEnd"/>
+      <w:r>
+        <w:t xml:space="preserve"> OOP workflow instead of being a direct field change</w:t>
+      </w:r>
+      <w:r>
+        <w:t>.</w:t>
+      </w:r>
+    </w:p>
+    <w:p/>
+    <w:p>
+      <w:r>
+        <w:t xml:space="preserve">The third Sequence diagram was </w:t>
+      </w:r>
+      <w:proofErr w:type="spellStart"/>
+      <w:r>
+        <w:t>modeeled</w:t>
+      </w:r>
+      <w:proofErr w:type="spellEnd"/>
+      <w:r>
+        <w:t xml:space="preserve"> on use case Staff adds new </w:t>
+      </w:r>
+      <w:proofErr w:type="spellStart"/>
+      <w:r>
+        <w:t>SHipemt</w:t>
+      </w:r>
+      <w:proofErr w:type="spellEnd"/>
+      <w:r>
+        <w:t xml:space="preserve">. Shipment creating is a very essential and </w:t>
+      </w:r>
+      <w:proofErr w:type="spellStart"/>
+      <w:r>
+        <w:t>privotoal</w:t>
+      </w:r>
+      <w:proofErr w:type="spellEnd"/>
+      <w:r>
+        <w:t xml:space="preserve"> </w:t>
+      </w:r>
+      <w:proofErr w:type="spellStart"/>
+      <w:r>
+        <w:t>poit</w:t>
+      </w:r>
+      <w:proofErr w:type="spellEnd"/>
+      <w:r>
+        <w:t xml:space="preserve"> in </w:t>
+      </w:r>
+      <w:proofErr w:type="spellStart"/>
+      <w:r>
+        <w:t>th</w:t>
+      </w:r>
+      <w:proofErr w:type="spellEnd"/>
+      <w:r>
+        <w:t xml:space="preserve"> </w:t>
+      </w:r>
+      <w:proofErr w:type="spellStart"/>
+      <w:r>
+        <w:t>emafniefrehgt</w:t>
+      </w:r>
+      <w:proofErr w:type="spellEnd"/>
+      <w:r>
+        <w:t xml:space="preserve"> </w:t>
+      </w:r>
+      <w:r>
+        <w:t xml:space="preserve">system. IN the context </w:t>
+      </w:r>
+      <w:proofErr w:type="spellStart"/>
+      <w:r>
+        <w:t>fo</w:t>
+      </w:r>
+      <w:proofErr w:type="spellEnd"/>
+      <w:r>
+        <w:t xml:space="preserve"> the </w:t>
+      </w:r>
+      <w:proofErr w:type="spellStart"/>
+      <w:r>
+        <w:t>organsitiaion</w:t>
+      </w:r>
+      <w:proofErr w:type="spellEnd"/>
+      <w:r>
+        <w:t>, Mainfreight Shipment is an object that transport staff have access to update  warehouse staff locate, customer staff need to explain</w:t>
+      </w:r>
+      <w:r>
+        <w:t xml:space="preserve"> and the only customer </w:t>
+      </w:r>
+      <w:proofErr w:type="spellStart"/>
+      <w:r>
+        <w:t>facin</w:t>
+      </w:r>
+      <w:proofErr w:type="spellEnd"/>
+      <w:r>
+        <w:t xml:space="preserve"> interaction is based on shipment creation. If this is handled </w:t>
+      </w:r>
+      <w:proofErr w:type="spellStart"/>
+      <w:r>
+        <w:t>throught</w:t>
+      </w:r>
+      <w:proofErr w:type="spellEnd"/>
+      <w:r>
+        <w:t xml:space="preserve"> hr menu method it </w:t>
+      </w:r>
+      <w:proofErr w:type="spellStart"/>
+      <w:r>
+        <w:t>rsisk</w:t>
+      </w:r>
+      <w:proofErr w:type="spellEnd"/>
+      <w:r>
+        <w:t xml:space="preserve"> creating duplicated of the same </w:t>
+      </w:r>
+      <w:proofErr w:type="spellStart"/>
+      <w:r>
+        <w:t>shipment,incomplete</w:t>
+      </w:r>
+      <w:proofErr w:type="spellEnd"/>
+      <w:r>
+        <w:t xml:space="preserve"> and even </w:t>
+      </w:r>
+      <w:proofErr w:type="spellStart"/>
+      <w:r>
+        <w:t>unauthrroised</w:t>
+      </w:r>
+      <w:proofErr w:type="spellEnd"/>
+      <w:r>
+        <w:t xml:space="preserve"> shipment record. This confuses and damages every alter process that is built on that shipment record. The controlled </w:t>
+      </w:r>
+      <w:proofErr w:type="spellStart"/>
+      <w:r>
+        <w:t>worok</w:t>
+      </w:r>
+      <w:proofErr w:type="spellEnd"/>
+      <w:r>
+        <w:t xml:space="preserve"> </w:t>
+      </w:r>
+      <w:proofErr w:type="spellStart"/>
+      <w:r>
+        <w:t>flwo</w:t>
+      </w:r>
+      <w:proofErr w:type="spellEnd"/>
+      <w:r>
+        <w:t xml:space="preserve"> is </w:t>
+      </w:r>
+      <w:proofErr w:type="spellStart"/>
+      <w:r>
+        <w:t>modeeled</w:t>
+      </w:r>
+      <w:proofErr w:type="spellEnd"/>
+      <w:r>
+        <w:t xml:space="preserve"> as </w:t>
+      </w:r>
+      <w:proofErr w:type="spellStart"/>
+      <w:r>
+        <w:t>StaffMenu</w:t>
+      </w:r>
+      <w:proofErr w:type="spellEnd"/>
+      <w:r>
+        <w:t xml:space="preserve"> collects the input , the </w:t>
+      </w:r>
+      <w:proofErr w:type="spellStart"/>
+      <w:r>
+        <w:t>shipmentcontorller</w:t>
+      </w:r>
+      <w:proofErr w:type="spellEnd"/>
+      <w:r>
+        <w:t xml:space="preserve"> </w:t>
+      </w:r>
+      <w:proofErr w:type="spellStart"/>
+      <w:r>
+        <w:t>maages</w:t>
+      </w:r>
+      <w:proofErr w:type="spellEnd"/>
+      <w:r>
+        <w:t xml:space="preserve"> the use case</w:t>
+      </w:r>
+      <w:r>
+        <w:t xml:space="preserve"> and calls on </w:t>
+      </w:r>
+      <w:proofErr w:type="spellStart"/>
+      <w:r>
+        <w:t>accessconrolsercie</w:t>
+      </w:r>
+      <w:proofErr w:type="spellEnd"/>
+      <w:r>
+        <w:t xml:space="preserve"> who confirms that the staff </w:t>
+      </w:r>
+      <w:proofErr w:type="spellStart"/>
+      <w:r>
+        <w:t>memeebr</w:t>
+      </w:r>
+      <w:proofErr w:type="spellEnd"/>
+      <w:r>
+        <w:t xml:space="preserve"> is allowed to create a shipment. The </w:t>
+      </w:r>
+      <w:proofErr w:type="spellStart"/>
+      <w:r>
+        <w:t>the</w:t>
+      </w:r>
+      <w:proofErr w:type="spellEnd"/>
+      <w:r>
+        <w:t xml:space="preserve"> </w:t>
+      </w:r>
+      <w:proofErr w:type="spellStart"/>
+      <w:r>
+        <w:t>shipemrepo</w:t>
+      </w:r>
+      <w:proofErr w:type="spellEnd"/>
+      <w:r>
+        <w:t xml:space="preserve"> checks inside its </w:t>
+      </w:r>
+      <w:proofErr w:type="spellStart"/>
+      <w:r>
+        <w:t>reporsity</w:t>
+      </w:r>
+      <w:proofErr w:type="spellEnd"/>
+      <w:r>
+        <w:t xml:space="preserve"> to </w:t>
+      </w:r>
+      <w:r>
+        <w:t xml:space="preserve">see fi the </w:t>
+      </w:r>
+      <w:proofErr w:type="spellStart"/>
+      <w:r>
+        <w:t>shipement</w:t>
+      </w:r>
+      <w:proofErr w:type="spellEnd"/>
+      <w:r>
+        <w:t xml:space="preserve"> is preexisting</w:t>
+      </w:r>
+      <w:r>
+        <w:t xml:space="preserve"> then a new </w:t>
+      </w:r>
+      <w:proofErr w:type="spellStart"/>
+      <w:r>
+        <w:t>shipemnr</w:t>
+      </w:r>
+      <w:proofErr w:type="spellEnd"/>
+      <w:r>
+        <w:t xml:space="preserve"> is created and stored. It </w:t>
+      </w:r>
+      <w:proofErr w:type="spellStart"/>
+      <w:r>
+        <w:t>proctects</w:t>
+      </w:r>
+      <w:proofErr w:type="spellEnd"/>
+      <w:r>
+        <w:t xml:space="preserve"> the </w:t>
+      </w:r>
+      <w:proofErr w:type="spellStart"/>
+      <w:r>
+        <w:t>intergrritty</w:t>
+      </w:r>
+      <w:proofErr w:type="spellEnd"/>
+      <w:r>
+        <w:t xml:space="preserve"> of hr </w:t>
+      </w:r>
+      <w:proofErr w:type="spellStart"/>
+      <w:r>
+        <w:t>shipemt</w:t>
+      </w:r>
+      <w:proofErr w:type="spellEnd"/>
+      <w:r>
+        <w:t xml:space="preserve"> object </w:t>
+      </w:r>
+      <w:r>
+        <w:t xml:space="preserve">before it enters the workflow protecting it from other threats. Cohesion is </w:t>
+      </w:r>
+      <w:proofErr w:type="spellStart"/>
+      <w:r>
+        <w:t>demaotrated</w:t>
+      </w:r>
+      <w:proofErr w:type="spellEnd"/>
+      <w:r>
+        <w:t xml:space="preserve"> because the menu does not won any of the business rules, the controller </w:t>
+      </w:r>
+      <w:proofErr w:type="spellStart"/>
+      <w:r>
+        <w:t>cannotstore</w:t>
+      </w:r>
+      <w:proofErr w:type="spellEnd"/>
+      <w:r>
+        <w:t xml:space="preserve"> an </w:t>
+      </w:r>
+      <w:proofErr w:type="spellStart"/>
+      <w:r>
+        <w:t>afata</w:t>
+      </w:r>
+      <w:proofErr w:type="spellEnd"/>
+      <w:r>
+        <w:t xml:space="preserve"> and the </w:t>
+      </w:r>
+      <w:proofErr w:type="spellStart"/>
+      <w:r>
+        <w:t>repstory</w:t>
+      </w:r>
+      <w:proofErr w:type="spellEnd"/>
+      <w:r>
+        <w:t xml:space="preserve"> does not authenticate the staff</w:t>
+      </w:r>
+      <w:r>
+        <w:t>. Each pat of the workflow is contributed by a separate class which makes it easier to follow the rule of “Open to extension, closed for modification”(week 12).</w:t>
+      </w:r>
+    </w:p>
+    <w:p/>
+    <w:p>
+      <w:r>
+        <w:t>Activity diagram 1: Customer Tracks Shipment</w:t>
+      </w:r>
+    </w:p>
+    <w:p/>
+    <w:p/>
+    <w:p/>
+    <w:p/>
+    <w:p/>
+    <w:p/>
+    <w:p/>
+    <w:p/>
+    <w:p/>
+    <w:p/>
+    <w:p/>
+    <w:p/>
+    <w:p/>
+    <w:p/>
+    <w:p>
+      <w:r>
+        <w:t>3.1  refined class diagram plan</w:t>
       </w:r>
     </w:p>
     <w:p>
       <w:r>
-        <w:t>5. task 7: comparative design analysis</w:t>
+        <w:t>3.2 planned sequence diagram</w:t>
       </w:r>
     </w:p>
     <w:p>
       <w:r>
-        <w:t>6. task 8: critical reflection</w:t>
+        <w:t>3.3 planned activity and state diagrams</w:t>
       </w:r>
     </w:p>
     <w:p>
       <w:r>
-        <w:t>7.Conclusion</w:t>
+        <w:t xml:space="preserve">4. task 6: </w:t>
+      </w:r>
+      <w:r>
+        <w:t>design pattern and application</w:t>
       </w:r>
     </w:p>
     <w:p>
       <w:r>
-        <w:t>8. refernces</w:t>
-      </w:r>
+        <w:t>The first design pattern chosen was the Fac</w:t>
+      </w:r>
+      <w:r>
+        <w:t xml:space="preserve">tory method, </w:t>
+      </w:r>
+    </w:p>
+    <w:p>
+      <w:r>
+        <w:t>5. task 7: comparative design analysis</w:t>
+      </w:r>
+    </w:p>
+    <w:p>
+      <w:r>
+        <w:t>6. task 8: critical reflection</w:t>
+      </w:r>
+    </w:p>
+    <w:p>
+      <w:r>
+        <w:t>7.Conclusion</w:t>
+      </w:r>
+    </w:p>
+    <w:p>
+      <w:r>
+        <w:t xml:space="preserve">8. </w:t>
+      </w:r>
+      <w:proofErr w:type="spellStart"/>
+      <w:r>
+        <w:t>refernces</w:t>
+      </w:r>
+      <w:proofErr w:type="spellEnd"/>
     </w:p>
     <w:p/>
     <w:sectPr>
@@ -698,6 +2309,7 @@
   <w:style w:type="character" w:default="1" w:styleId="DefaultParagraphFont">
     <w:name w:val="Default Paragraph Font"/>
     <w:uiPriority w:val="1"/>
+    <w:semiHidden/>
     <w:unhideWhenUsed/>
   </w:style>
   <w:style w:type="table" w:default="1" w:styleId="TableNormal">

</xml_diff>

<commit_message>
Added github repo and instruction
</commit_message>
<xml_diff>
--- a/Data Processing Report Phase 2.docx
+++ b/Data Processing Report Phase 2.docx
@@ -134,6 +134,7 @@
           </w:placeholder>
           <w15:appearance w15:val="hidden"/>
         </w:sdtPr>
+        <w:sdtEndPr/>
         <w:sdtContent>
           <w:r>
             <w:rPr>
@@ -160,6 +161,7 @@
         </w:placeholder>
         <w15:appearance w15:val="hidden"/>
       </w:sdtPr>
+      <w:sdtEndPr/>
       <w:sdtContent>
         <w:p>
           <w:pPr>
@@ -179,8 +181,79 @@
             <w:t>Student ID: 23198431</w:t>
           </w:r>
         </w:p>
+        <w:p>
+          <w:pPr>
+            <w:jc w:val="center"/>
+            <w:rPr>
+              <w:sz w:val="36"/>
+              <w:szCs w:val="36"/>
+              <w:lang w:val="en-US"/>
+            </w:rPr>
+          </w:pPr>
+          <w:r>
+            <w:rPr>
+              <w:sz w:val="36"/>
+              <w:szCs w:val="36"/>
+              <w:lang w:val="en-US"/>
+            </w:rPr>
+            <w:t>GitHub:</w:t>
+          </w:r>
+          <w:r>
+            <w:t xml:space="preserve"> </w:t>
+          </w:r>
+          <w:r>
+            <w:rPr>
+              <w:sz w:val="36"/>
+              <w:szCs w:val="36"/>
+              <w:lang w:val="en-US"/>
+            </w:rPr>
+            <w:t>https://github.com/laksrahaha/Mainfreight-Project--Sravani-Kunapuli.git</w:t>
+          </w:r>
+        </w:p>
       </w:sdtContent>
     </w:sdt>
+    <w:p>
+      <w:pPr>
+        <w:jc w:val="center"/>
+        <w:rPr>
+          <w:b/>
+          <w:bCs/>
+          <w:sz w:val="30"/>
+          <w:szCs w:val="30"/>
+          <w:lang w:val="en-US"/>
+        </w:rPr>
+      </w:pPr>
+      <w:r>
+        <w:rPr>
+          <w:b/>
+          <w:bCs/>
+          <w:sz w:val="30"/>
+          <w:szCs w:val="30"/>
+          <w:lang w:val="en-US"/>
+        </w:rPr>
+        <w:t xml:space="preserve">*Note as mentioned in the Appendix , the </w:t>
+      </w:r>
+      <w:r>
+        <w:rPr>
+          <w:b/>
+          <w:bCs/>
+          <w:sz w:val="30"/>
+          <w:szCs w:val="30"/>
+          <w:lang w:val="en-US"/>
+        </w:rPr>
+        <w:t>code branch for phase 2 is Code-Phase-2-Real</w:t>
+      </w:r>
+      <w:r>
+        <w:rPr>
+          <w:b/>
+          <w:bCs/>
+          <w:sz w:val="30"/>
+          <w:szCs w:val="30"/>
+          <w:lang w:val="en-US"/>
+        </w:rPr>
+        <w:t>.</w:t>
+      </w:r>
+    </w:p>
     <w:p>
       <w:pPr>
         <w:rPr>
@@ -247,19 +320,17 @@
         </w:rPr>
       </w:pPr>
     </w:p>
-    <w:p>
-      <w:pPr>
-        <w:rPr>
-          <w:b/>
-          <w:bCs/>
-          <w:sz w:val="46"/>
-          <w:szCs w:val="46"/>
-          <w:lang w:val="en-US"/>
-        </w:rPr>
-      </w:pPr>
-    </w:p>
     <w:sdt>
       <w:sdtPr>
+        <w:rPr>
+          <w:rFonts w:asciiTheme="minorHAnsi" w:eastAsiaTheme="minorHAnsi" w:hAnsiTheme="minorHAnsi" w:cstheme="minorBidi"/>
+          <w:color w:val="auto"/>
+          <w:kern w:val="2"/>
+          <w:sz w:val="24"/>
+          <w:szCs w:val="24"/>
+          <w:lang w:val="en-NZ"/>
+          <w14:ligatures w14:val="standardContextual"/>
+        </w:rPr>
         <w:id w:val="-1209486633"/>
         <w:docPartObj>
           <w:docPartGallery w:val="Table of Contents"/>
@@ -268,16 +339,9 @@
       </w:sdtPr>
       <w:sdtEndPr>
         <w:rPr>
-          <w:rFonts w:asciiTheme="minorHAnsi" w:eastAsiaTheme="minorHAnsi" w:hAnsiTheme="minorHAnsi" w:cstheme="minorBidi"/>
           <w:b/>
           <w:bCs/>
           <w:noProof/>
-          <w:color w:val="auto"/>
-          <w:kern w:val="2"/>
-          <w:sz w:val="24"/>
-          <w:szCs w:val="24"/>
-          <w:lang w:val="en-NZ"/>
-          <w14:ligatures w14:val="standardContextual"/>
         </w:rPr>
       </w:sdtEndPr>
       <w:sdtContent>
@@ -307,6 +371,7 @@
               </w:placeholder>
               <w15:appearance w15:val="hidden"/>
             </w:sdtPr>
+            <w:sdtEndPr/>
             <w:sdtContent>
               <w:r>
                 <w:t>Contents</w:t>
@@ -1281,6 +1346,7 @@
                 </w:placeholder>
                 <w15:appearance w15:val="hidden"/>
               </w:sdtPr>
+              <w:sdtEndPr/>
               <w:sdtContent>
                 <w:r>
                   <w:rPr>
@@ -1565,6 +1631,7 @@
           </w:placeholder>
           <w15:appearance w15:val="hidden"/>
         </w:sdtPr>
+        <w:sdtEndPr/>
         <w:sdtContent>
           <w:r>
             <w:t>end-to-end</w:t>
@@ -1592,6 +1659,7 @@
           </w:placeholder>
           <w15:appearance w15:val="hidden"/>
         </w:sdtPr>
+        <w:sdtEndPr/>
         <w:sdtContent>
           <w:r>
             <w:t xml:space="preserve">warehousing, domestic and international </w:t>
@@ -1616,6 +1684,7 @@
           </w:placeholder>
           <w15:appearance w15:val="hidden"/>
         </w:sdtPr>
+        <w:sdtEndPr/>
         <w:sdtContent>
           <w:r>
             <w:t>worldwide air and ocean freight services(Mainfreight</w:t>
@@ -1971,15 +2040,7 @@
         <w:t>*Note for all diagrams</w:t>
       </w:r>
       <w:r>
-        <w:t xml:space="preserve"> please refer to the Phase 2 Diagram branch on </w:t>
-      </w:r>
-      <w:proofErr w:type="spellStart"/>
-      <w:r>
-        <w:t>github</w:t>
-      </w:r>
-      <w:proofErr w:type="spellEnd"/>
-      <w:r>
-        <w:t xml:space="preserve"> for a better look.</w:t>
+        <w:t xml:space="preserve"> please refer to the Phase 2 Diagram branch on github for a better look.</w:t>
       </w:r>
     </w:p>
     <w:p>
@@ -2583,6 +2644,7 @@
           <w:id w:val="-734703841"/>
           <w:citation/>
         </w:sdtPr>
+        <w:sdtEndPr/>
         <w:sdtContent>
           <w:r>
             <w:fldChar w:fldCharType="begin"/>
@@ -2742,7 +2804,7 @@
         </w:rPr>
         <w:lastRenderedPageBreak/>
         <w:drawing>
-          <wp:inline distT="0" distB="0" distL="0" distR="0" wp14:anchorId="6A4D67FD" wp14:editId="100B2517">
+          <wp:inline distT="0" distB="0" distL="0" distR="0" wp14:anchorId="6A4D67FD" wp14:editId="670B70FA">
             <wp:extent cx="5731510" cy="4744085"/>
             <wp:effectExtent l="0" t="0" r="2540" b="0"/>
             <wp:docPr id="1343361367" name="Picture 6"/>
@@ -2995,6 +3057,7 @@
           <w:id w:val="-1561775807"/>
           <w:citation/>
         </w:sdtPr>
+        <w:sdtEndPr/>
         <w:sdtContent>
           <w:r>
             <w:fldChar w:fldCharType="begin"/>
@@ -3148,7 +3211,7 @@
         </w:rPr>
         <w:lastRenderedPageBreak/>
         <w:drawing>
-          <wp:inline distT="0" distB="0" distL="0" distR="0" wp14:anchorId="5BCC1727" wp14:editId="30C4FC2D">
+          <wp:inline distT="0" distB="0" distL="0" distR="0" wp14:anchorId="5BCC1727" wp14:editId="0FE53413">
             <wp:extent cx="5731510" cy="5634990"/>
             <wp:effectExtent l="0" t="0" r="2540" b="3810"/>
             <wp:docPr id="2123916784" name="Picture 9"/>
@@ -3914,6 +3977,7 @@
           </w:placeholder>
           <w15:appearance w15:val="hidden"/>
         </w:sdtPr>
+        <w:sdtEndPr/>
         <w:sdtContent>
           <w:r>
             <w:t xml:space="preserve">of </w:t>
@@ -4007,6 +4071,7 @@
           <w:id w:val="-865757887"/>
           <w:citation/>
         </w:sdtPr>
+        <w:sdtEndPr/>
         <w:sdtContent>
           <w:r>
             <w:fldChar w:fldCharType="begin"/>
@@ -4051,6 +4116,7 @@
           </w:placeholder>
           <w15:appearance w15:val="hidden"/>
         </w:sdtPr>
+        <w:sdtEndPr/>
         <w:sdtContent>
           <w:r>
             <w:t>creates the correct</w:t>
@@ -4069,6 +4135,7 @@
           </w:placeholder>
           <w15:appearance w15:val="hidden"/>
         </w:sdtPr>
+        <w:sdtEndPr/>
         <w:sdtContent>
           <w:r>
             <w:t>object based</w:t>
@@ -4097,6 +4164,7 @@
           </w:placeholder>
           <w15:appearance w15:val="hidden"/>
         </w:sdtPr>
+        <w:sdtEndPr/>
         <w:sdtContent>
           <w:r>
             <w:t>can be added by creating a</w:t>
@@ -4115,6 +4183,7 @@
           </w:placeholder>
           <w15:appearance w15:val="hidden"/>
         </w:sdtPr>
+        <w:sdtEndPr/>
         <w:sdtContent>
           <w:r>
             <w:t xml:space="preserve">new </w:t>
@@ -4170,6 +4239,7 @@
           <w:id w:val="-1364973730"/>
           <w:citation/>
         </w:sdtPr>
+        <w:sdtEndPr/>
         <w:sdtContent>
           <w:r>
             <w:fldChar w:fldCharType="begin"/>
@@ -5063,6 +5133,7 @@
           <w:id w:val="2025137457"/>
           <w:citation/>
         </w:sdtPr>
+        <w:sdtEndPr/>
         <w:sdtContent>
           <w:r>
             <w:fldChar w:fldCharType="begin"/>
@@ -5105,7 +5176,7 @@
           <w:noProof/>
         </w:rPr>
         <w:drawing>
-          <wp:inline distT="0" distB="0" distL="0" distR="0" wp14:anchorId="7354C8F6" wp14:editId="6D45FB42">
+          <wp:inline distT="0" distB="0" distL="0" distR="0" wp14:anchorId="7354C8F6" wp14:editId="76CF75C0">
             <wp:extent cx="5731510" cy="2508250"/>
             <wp:effectExtent l="0" t="0" r="2540" b="6350"/>
             <wp:docPr id="489156901" name="Picture 11"/>
@@ -5257,6 +5328,7 @@
           <w:id w:val="1321079968"/>
           <w:citation/>
         </w:sdtPr>
+        <w:sdtEndPr/>
         <w:sdtContent>
           <w:r>
             <w:fldChar w:fldCharType="begin"/>
@@ -5283,6 +5355,7 @@
           <w:id w:val="1157891703"/>
           <w:citation/>
         </w:sdtPr>
+        <w:sdtEndPr/>
         <w:sdtContent>
           <w:r>
             <w:fldChar w:fldCharType="begin"/>
@@ -5331,6 +5404,7 @@
           <w:id w:val="396712990"/>
           <w:citation/>
         </w:sdtPr>
+        <w:sdtEndPr/>
         <w:sdtContent>
           <w:r>
             <w:fldChar w:fldCharType="begin"/>
@@ -5372,6 +5446,7 @@
           </w:placeholder>
           <w15:appearance w15:val="hidden"/>
         </w:sdtPr>
+        <w:sdtEndPr/>
         <w:sdtContent>
           <w:r>
             <w:rPr>
@@ -5602,15 +5677,7 @@
     <w:p>
       <w:r>
         <w:lastRenderedPageBreak/>
-        <w:t xml:space="preserve">The hardest part of the project was understanding how to apply the design patterns properly and then explain why they were used. I also had anxiety around starting the report because the report needed to justify every design choice, not just describe what was implemented. Another challenge was Git version control. One branch became corrupted, so the project had to be cloned and </w:t>
-      </w:r>
-      <w:proofErr w:type="gramStart"/>
-      <w:r>
-        <w:t>continued on</w:t>
-      </w:r>
-      <w:proofErr w:type="gramEnd"/>
-      <w:r>
-        <w:t xml:space="preserve"> another branch. This made the development process more stressful and showed me that I need to manage branches and commits more carefully in future projects.</w:t>
+        <w:t>The hardest part of the project was understanding how to apply the design patterns properly and then explain why they were used. I also had anxiety around starting the report because the report needed to justify every design choice, not just describe what was implemented. Another challenge was Git version control. One branch became corrupted, so the project had to be cloned and continued on another branch. This made the development process more stressful and showed me that I need to manage branches and commits more carefully in future projects.</w:t>
       </w:r>
     </w:p>
     <w:p>
@@ -5635,7 +5702,7 @@
           <w:noProof/>
         </w:rPr>
         <w:drawing>
-          <wp:inline distT="0" distB="0" distL="0" distR="0" wp14:anchorId="14AAC0DF" wp14:editId="37BDD482">
+          <wp:inline distT="0" distB="0" distL="0" distR="0" wp14:anchorId="14AAC0DF" wp14:editId="1414A375">
             <wp:extent cx="5731510" cy="3486785"/>
             <wp:effectExtent l="0" t="0" r="2540" b="0"/>
             <wp:docPr id="1351901143" name="Picture 4"/>
@@ -5738,20 +5805,19 @@
     <w:bookmarkStart w:id="14" w:name="_Toc231133438" w:displacedByCustomXml="next"/>
     <w:sdt>
       <w:sdtPr>
+        <w:rPr>
+          <w:rFonts w:asciiTheme="minorHAnsi" w:eastAsiaTheme="minorHAnsi" w:hAnsiTheme="minorHAnsi" w:cstheme="minorBidi"/>
+          <w:color w:val="auto"/>
+          <w:sz w:val="24"/>
+          <w:szCs w:val="24"/>
+        </w:rPr>
         <w:id w:val="-754823074"/>
         <w:docPartObj>
           <w:docPartGallery w:val="Bibliographies"/>
           <w:docPartUnique/>
         </w:docPartObj>
       </w:sdtPr>
-      <w:sdtEndPr>
-        <w:rPr>
-          <w:rFonts w:asciiTheme="minorHAnsi" w:eastAsiaTheme="minorHAnsi" w:hAnsiTheme="minorHAnsi" w:cstheme="minorBidi"/>
-          <w:color w:val="auto"/>
-          <w:sz w:val="24"/>
-          <w:szCs w:val="24"/>
-        </w:rPr>
-      </w:sdtEndPr>
+      <w:sdtEndPr/>
       <w:sdtContent>
         <w:p>
           <w:pPr>
@@ -5770,6 +5836,7 @@
             <w:id w:val="-573587230"/>
             <w:bibliography/>
           </w:sdtPr>
+          <w:sdtEndPr/>
           <w:sdtContent>
             <w:p>
               <w:pPr>
@@ -7111,6 +7178,7 @@
   <w:style w:type="character" w:default="1" w:styleId="DefaultParagraphFont">
     <w:name w:val="Default Paragraph Font"/>
     <w:uiPriority w:val="1"/>
+    <w:semiHidden/>
     <w:unhideWhenUsed/>
   </w:style>
   <w:style w:type="table" w:default="1" w:styleId="TableNormal">
@@ -7639,6 +7707,7 @@
   <w:rsids>
     <w:rsidRoot w:val="00FA1D7B"/>
     <w:rsid w:val="00871689"/>
+    <w:rsid w:val="009C6BED"/>
     <w:rsid w:val="00D16E63"/>
     <w:rsid w:val="00FA1D7B"/>
   </w:rsids>

</xml_diff>